<commit_message>
Popraw łamanie wierszy we wnioskach do MZ
Co-Authored-By: Claude Opus 5.5 <noreply@anthropic.com>
Claude-Session: https://claude.ai/code/session_019jaYASJxLt3b2qxxJQMkS2
</commit_message>
<xml_diff>
--- a/pliki/wniosek-MZ-gdzie-pacjent-po-pilotazu.docx
+++ b/pliki/wniosek-MZ-gdzie-pacjent-po-pilotazu.docx
@@ -20,13 +20,13 @@
         <w:t xml:space="preserve">Minister Zdrowia</w:t>
       </w:r>
       <w:r>
-        <w:t xml:space="preserve"> </w:t>
+        <w:br/>
       </w:r>
       <w:r>
         <w:t xml:space="preserve">Ministerstwo Zdrowia, ul. Miodowa 15, 00-952 Warszawa</w:t>
       </w:r>
       <w:r>
-        <w:t xml:space="preserve"> </w:t>
+        <w:br/>
       </w:r>
       <w:r>
         <w:t xml:space="preserve">e-mail: kancelaria@mz.gov.pl</w:t>
@@ -196,7 +196,7 @@
         <w:t xml:space="preserve">Z poważaniem,</w:t>
       </w:r>
       <w:r>
-        <w:t xml:space="preserve"> </w:t>
+        <w:br/>
       </w:r>
       <w:r>
         <w:t xml:space="preserve">[imię i nazwisko – opcjonalnie, nie jest wymagane]</w:t>

</xml_diff>